<commit_message>
Initiale Version DaZ Programm
</commit_message>
<xml_diff>
--- a/Was noch machen.docx
+++ b/Was noch machen.docx
@@ -12,23 +12,7 @@
       </w:r>
       <w:r>
         <w:br/>
-        <w:t xml:space="preserve">Button </w:t>
-      </w:r>
-      <w:proofErr w:type="gramStart"/>
-      <w:r>
-        <w:t>einfügen</w:t>
-      </w:r>
-      <w:proofErr w:type="gramEnd"/>
-      <w:r>
-        <w:t xml:space="preserve"> dass man zum Hauptmenü </w:t>
-      </w:r>
-      <w:proofErr w:type="gramStart"/>
-      <w:r>
-        <w:t>zurück kann</w:t>
-      </w:r>
-      <w:proofErr w:type="gramEnd"/>
-      <w:r>
-        <w:t>, bei den Lektionen</w:t>
+        <w:t>Button einfügen dass man zum Hauptmenü zurück kann, bei den Lektionen</w:t>
       </w:r>
     </w:p>
     <w:p>
@@ -116,7 +100,35 @@
       <w:r>
         <w:t>Sprachausgabe läuft nur mit Edge</w:t>
       </w:r>
-    </w:p>
+      <w:r>
+        <w:t xml:space="preserve">/ </w:t>
+      </w:r>
+      <w:proofErr w:type="spellStart"/>
+      <w:r>
+        <w:t>evtl</w:t>
+      </w:r>
+      <w:proofErr w:type="spellEnd"/>
+      <w:r>
+        <w:t xml:space="preserve"> auch Firefox- aber eher Microsoft </w:t>
+      </w:r>
+      <w:proofErr w:type="spellStart"/>
+      <w:r>
+        <w:t>edge</w:t>
+      </w:r>
+      <w:proofErr w:type="spellEnd"/>
+    </w:p>
+    <w:p>
+      <w:r>
+        <w:t>Bei arabisch und wahrscheinlich bei den anderen Sprachen, die man irgendwie von rechts nach links schreibt. Da ist noch ein Problem bei der Eingabe der Sachen, das ist ******* da muss ich noch wieder bei. Also wenn ich da ein Wort eingebe, wird das von rechts nach links eingegeben. So ein Schwachsinn.</w:t>
+      </w:r>
+    </w:p>
+    <w:p/>
+    <w:p>
+      <w:r>
+        <w:t>Beim Eingeben der Wörter kann ich immer nur einen Buchstaben eingeben, dann verschwindet die Tastatur wieder bei meinem Handy.</w:t>
+      </w:r>
+    </w:p>
+    <w:p/>
     <w:p/>
     <w:p>
       <w:pPr>
@@ -125,6 +137,9 @@
           <w:bCs/>
         </w:rPr>
       </w:pPr>
+      <w:r>
+        <w:t>Gut.</w:t>
+      </w:r>
       <w:r>
         <w:rPr>
           <w:b/>
@@ -170,15 +185,7 @@
       </w:r>
       <w:r>
         <w:br/>
-        <w:t xml:space="preserve">Wenn dein Mac Arabisch </w:t>
-      </w:r>
-      <w:proofErr w:type="gramStart"/>
-      <w:r>
-        <w:t>installiert</w:t>
-      </w:r>
-      <w:proofErr w:type="gramEnd"/>
-      <w:r>
-        <w:t xml:space="preserve"> hat → Safari kann es sicher vorlesen.</w:t>
+        <w:t>Wenn dein Mac Arabisch installiert hat → Safari kann es sicher vorlesen.</w:t>
       </w:r>
     </w:p>
     <w:p>
@@ -198,21 +205,12 @@
           <w:numId w:val="2"/>
         </w:numPr>
       </w:pPr>
-      <w:proofErr w:type="spellStart"/>
       <w:r>
         <w:rPr>
           <w:b/>
           <w:bCs/>
         </w:rPr>
-        <w:t>Maged</w:t>
-      </w:r>
-      <w:proofErr w:type="spellEnd"/>
-      <w:r>
-        <w:rPr>
-          <w:b/>
-          <w:bCs/>
-        </w:rPr>
-        <w:t xml:space="preserve"> (</w:t>
+        <w:t>Maged (</w:t>
       </w:r>
       <w:proofErr w:type="spellStart"/>
       <w:r>
@@ -331,6 +329,20 @@
       </w:r>
       <w:r>
         <w:t>.</w:t>
+      </w:r>
+    </w:p>
+    <w:p/>
+    <w:p>
+      <w:r>
+        <w:t xml:space="preserve">Hauptmenü noch schöner machen mit </w:t>
+      </w:r>
+      <w:proofErr w:type="spellStart"/>
+      <w:r>
+        <w:t>emojis</w:t>
+      </w:r>
+      <w:proofErr w:type="spellEnd"/>
+      <w:r>
+        <w:t xml:space="preserve"> und so</w:t>
       </w:r>
     </w:p>
     <w:p/>
@@ -1219,6 +1231,7 @@
   <w:style w:type="character" w:default="1" w:styleId="Absatz-Standardschriftart">
     <w:name w:val="Default Paragraph Font"/>
     <w:uiPriority w:val="1"/>
+    <w:semiHidden/>
     <w:unhideWhenUsed/>
   </w:style>
   <w:style w:type="table" w:default="1" w:styleId="NormaleTabelle">

</xml_diff>